<commit_message>
docs(manuals): 매뉴얼 12종 메뉴 경로 Wave 1 IA 정합 — 61건 정정 + docx 재생성 (S339)
- 위치: 라인 51건 — 폐지된 메뉴(결재→결재함, 조직도→대량 인사이동, 성과→1:1,
  급여→해외 업로드, 분석→이직 위험 등)를 현행 사이드바 라벨+실제 라우트로 교체
- 본문 명시 경로 7건 (FAQ 내 급여→내 급여, 위임 설정, 성별 임금 격차 등)
- 코드 실측 기반: 분기 체크인=평가/성장 허브 탭 데모션, 퇴직 정산=별도 메뉴 없음,
  결재 플로우 설정은 기존 표기 유지(현행 일치 확인)
- attendance.md 출퇴근 정정 흐름에 직원 셀프 정정 UI 미제공 주석 (S338 P1 후보)
- 링크 배선 후속 3건: 교대·총 보상·비용 분석 위치를 신규 진입점 버튼 경로로 갱신
- 개념어(충원 요청·사내 공모·대량 인사이동)는 용어 정의 보유 도메인 용어라 유지
- md 수정 후 build-manuals.js로 docx 12종 재생성

Co-Authored-By: Claude Fable 5 <noreply@anthropic.com>
</commit_message>
<xml_diff>
--- a/docs/manuals/docx/01_휴가관리_매뉴얼.docx
+++ b/docs/manuals/docx/01_휴가관리_매뉴얼.docx
@@ -12467,7 +12467,42 @@
                 <w:sz w:val="22"/>
                 <w:szCs w:val="22"/>
               </w:rPr>
-              <w:t xml:space="preserve"> §10 참조</w:t>
+              <w:t xml:space="preserve"> §10 참조. (자동 cron 카탈로그 </w:t>
+            </w:r>
+            <w:r>
+              <w:rPr>
+                <w:rFonts w:ascii="Consolas" w:cs="Consolas" w:eastAsia="Consolas" w:hAnsi="Consolas"/>
+                <w:sz w:val="20"/>
+                <w:szCs w:val="20"/>
+                <w:shd w:fill="F2F2F2" w:color="auto" w:val="clear"/>
+              </w:rPr>
+              <w:t xml:space="preserve">scripts/handover/extract-cron-catalog.ts</w:t>
+            </w:r>
+            <w:r>
+              <w:rPr>
+                <w:rFonts w:ascii="Malgun Gothic" w:cs="Malgun Gothic" w:eastAsia="Malgun Gothic" w:hAnsi="Malgun Gothic"/>
+                <w:sz w:val="22"/>
+                <w:szCs w:val="22"/>
+              </w:rPr>
+              <w:t xml:space="preserve"> 기준 미등록 cron 총 </w:t>
+            </w:r>
+            <w:r>
+              <w:rPr>
+                <w:rFonts w:ascii="Malgun Gothic" w:cs="Malgun Gothic" w:eastAsia="Malgun Gothic" w:hAnsi="Malgun Gothic"/>
+                <w:b/>
+                <w:bCs/>
+                <w:sz w:val="22"/>
+                <w:szCs w:val="22"/>
+              </w:rPr>
+              <w:t xml:space="preserve">5개</w:t>
+            </w:r>
+            <w:r>
+              <w:rPr>
+                <w:rFonts w:ascii="Malgun Gothic" w:cs="Malgun Gothic" w:eastAsia="Malgun Gothic" w:hAnsi="Malgun Gothic"/>
+                <w:sz w:val="22"/>
+                <w:szCs w:val="22"/>
+              </w:rPr>
+              <w:t xml:space="preserve">: leave-promotion, auto-acknowledge, eval-reminder, overdue-check, org-snapshot — Session 218 핸드오버 Tier 1에서 자동 추출됨)</w:t>
             </w:r>
           </w:p>
         </w:tc>

</xml_diff>